<commit_message>
Productos sin marca ni logotipo: etiqueta genérica en portadas, portada Excel, presentación e infografías; marca opcional y configurable
Co-Authored-By: Claude Sonnet 5.5 <noreply@anthropic.com>
Claude-Session: https://claude.ai/code/session_01FbwLCqGiq6yuWgXYoX8NSd
</commit_message>
<xml_diff>
--- a/marketing/Mensajes_WhatsApp.docx
+++ b/marketing/Mensajes_WhatsApp.docx
@@ -31,7 +31,7 @@
     </w:p>
     <w:p>
       <w:r>
-        <w:t>Hola [NOMBRE], te escribo de Grupo Canville. Ayudamos a empresas industriales a ordenar nómina, cumplimiento fiscal/IMSS, compras y cobranza con un tablero semanal para dirección. ¿Te parece si agendamos 30 minutos esta semana para revisar dónde hoy hay más riesgo en [EMPRESA]? Orden para operar. Control para crecer.</w:t>
+        <w:t>Hola [NOMBRE], te escribo de [TU MARCA]. Ayudamos a empresas industriales a ordenar nómina, cumplimiento fiscal/IMSS, compras y cobranza con un tablero semanal para dirección. ¿Te parece si agendamos 30 minutos esta semana para revisar dónde hoy hay más riesgo en [EMPRESA]? Orden para operar. Control para crecer.</w:t>
       </w:r>
     </w:p>
     <w:p>
@@ -47,7 +47,7 @@
     </w:p>
     <w:p>
       <w:r>
-        <w:t>Hola [NOMBRE], soy [TU NOMBRE] de Grupo Canville. Trabajamos con constructoras para controlar compras, avance vs. presupuesto, pendientes y el cierre documental de cada obra. Un proyecto no termina al entregar: termina al cerrar bien. ¿Podemos platicar 30 minutos sobre [PROYECTO]?</w:t>
+        <w:t>Hola [NOMBRE], soy [TU NOMBRE] de [TU MARCA]. Trabajamos con constructoras para controlar compras, avance vs. presupuesto, pendientes y el cierre documental de cada obra. Un proyecto no termina al entregar: termina al cerrar bien. ¿Podemos platicar 30 minutos sobre [PROYECTO]?</w:t>
       </w:r>
     </w:p>
     <w:p>
@@ -63,7 +63,7 @@
     </w:p>
     <w:p>
       <w:r>
-        <w:t>Hola [NOMBRE], te contacto de Grupo Canville. Si hoy la administración de [EMPRESA] depende de archivos sueltos y memoria, podemos dejarte un sistema de formatos y controles listo en 30 días. ¿Tienes 30 minutos esta semana para mostrártelo?</w:t>
+        <w:t>Hola [NOMBRE], te contacto de [TU MARCA]. Si hoy la administración de [EMPRESA] depende de archivos sueltos y memoria, podemos dejarte un sistema de formatos y controles listo en 30 días. ¿Tienes 30 minutos esta semana para mostrártelo?</w:t>
       </w:r>
     </w:p>
     <w:p>

</xml_diff>

<commit_message>
Campaña de 10 infografías con composiciones distintas, copy comercial B2B, 3 adaptaciones reales por formato, QR, contactos y contraste verificado; marketing con marca configurable; guía de diseño actualizada
Co-Authored-By: Claude Sonnet 5.5 <noreply@anthropic.com>
Claude-Session: https://claude.ai/code/session_01FbwLCqGiq6yuWgXYoX8NSd
</commit_message>
<xml_diff>
--- a/marketing/Mensajes_WhatsApp.docx
+++ b/marketing/Mensajes_WhatsApp.docx
@@ -31,7 +31,7 @@
     </w:p>
     <w:p>
       <w:r>
-        <w:t>Hola [NOMBRE], te escribo de [TU MARCA]. Ayudamos a empresas industriales a ordenar nómina, cumplimiento fiscal/IMSS, compras y cobranza con un tablero semanal para dirección. ¿Te parece si agendamos 30 minutos esta semana para revisar dónde hoy hay más riesgo en [EMPRESA]? Orden para operar. Control para crecer.</w:t>
+        <w:t>Hola [NOMBRE], te escribo de Grupo Canville. Ayudamos a empresas industriales a ordenar nómina, cumplimiento fiscal/IMSS, compras y cobranza con un tablero semanal para dirección. ¿Te parece si agendamos 30 minutos esta semana para revisar dónde hoy hay más riesgo en [EMPRESA]? Orden para operar. Control para crecer.</w:t>
       </w:r>
     </w:p>
     <w:p>
@@ -47,7 +47,7 @@
     </w:p>
     <w:p>
       <w:r>
-        <w:t>Hola [NOMBRE], soy [TU NOMBRE] de [TU MARCA]. Trabajamos con constructoras para controlar compras, avance vs. presupuesto, pendientes y el cierre documental de cada obra. Un proyecto no termina al entregar: termina al cerrar bien. ¿Podemos platicar 30 minutos sobre [PROYECTO]?</w:t>
+        <w:t>Hola [NOMBRE], soy [TU NOMBRE] de Grupo Canville. Trabajamos con constructoras para controlar compras, avance vs. presupuesto, pendientes y el cierre documental de cada obra. Un proyecto no termina al entregar: termina al cerrar bien. ¿Podemos platicar 30 minutos sobre [PROYECTO]?</w:t>
       </w:r>
     </w:p>
     <w:p>
@@ -63,7 +63,7 @@
     </w:p>
     <w:p>
       <w:r>
-        <w:t>Hola [NOMBRE], te contacto de [TU MARCA]. Si hoy la administración de [EMPRESA] depende de archivos sueltos y memoria, podemos dejarte un sistema de formatos y controles listo en 30 días. ¿Tienes 30 minutos esta semana para mostrártelo?</w:t>
+        <w:t>Hola [NOMBRE], te contacto de Grupo Canville. Si hoy la administración de [EMPRESA] depende de archivos sueltos y memoria, podemos dejarte un sistema de formatos y controles listo en 30 días. ¿Tienes 30 minutos esta semana para mostrártelo?</w:t>
       </w:r>
     </w:p>
     <w:p>
@@ -202,12 +202,12 @@
         <w:rPr>
           <w:color w:val="0E7C8B"/>
         </w:rPr>
-        <w:t>Texto para Operación Bajo Control</w:t>
+        <w:t>Texto para Operacion bajo control</w:t>
       </w:r>
     </w:p>
     <w:p>
       <w:r>
-        <w:t>Operación bajo control: ordenar, planear, ejecutar y cerrar. ¿Cuál de los cuatro pasos te falta hoy? Escríbenos.</w:t>
+        <w:t>Si tu operación depende de recordatorios, ya necesitas un sistema de control: ordenar, planear, ejecutar, cerrar y aprender. Cada pendiente con responsable, fecha, evidencia y siguiente acción.</w:t>
       </w:r>
     </w:p>
     <w:p>
@@ -218,12 +218,12 @@
         <w:rPr>
           <w:color w:val="0E7C8B"/>
         </w:rPr>
-        <w:t>Texto para Nómina Sin Sorpresas</w:t>
+        <w:t>Texto para Facturacion y cobranza</w:t>
       </w:r>
     </w:p>
     <w:p>
       <w:r>
-        <w:t>Nómina sin sorpresas: de la asistencia al recibo archivado, con evidencia en cada paso.</w:t>
+        <w:t>Facturar no es cobrar. De la factura emitida a la conciliación: seguimiento, compromiso de pago y aplicación. Solicita una revisión de tu cartera y cobranza.</w:t>
       </w:r>
     </w:p>
     <w:p>
@@ -234,12 +234,12 @@
         <w:rPr>
           <w:color w:val="0E7C8B"/>
         </w:rPr>
-        <w:t>Texto para Fiscal E Imss Sin Improvisar</w:t>
+        <w:t>Texto para Plan de 30 dias</w:t>
       </w:r>
     </w:p>
     <w:p>
       <w:r>
-        <w:t>Fiscal e IMSS sin improvisar: calendario, acuses y expediente por mes.</w:t>
+        <w:t>30 días para saber qué está pendiente, quién lo atiende y cómo se cierra: diagnóstico, prioridades, ejecución y primer reporte para dirección.</w:t>
       </w:r>
     </w:p>
     <w:p>
@@ -250,12 +250,12 @@
         <w:rPr>
           <w:color w:val="0E7C8B"/>
         </w:rPr>
-        <w:t>Texto para Facturación Y Cobranza</w:t>
+        <w:t>Texto para Nomina sin sorpresas</w:t>
       </w:r>
     </w:p>
     <w:p>
       <w:r>
-        <w:t>Lo que se factura y no se cobra es riesgo. Revisa tu antigüedad de saldos cada semana.</w:t>
+        <w:t>Una nómina sin evidencia es un riesgo laboral. Entradas validadas, proceso controlado y resultados documentados, periodo por periodo.</w:t>
       </w:r>
     </w:p>
     <w:p>
@@ -266,12 +266,12 @@
         <w:rPr>
           <w:color w:val="0E7C8B"/>
         </w:rPr>
-        <w:t>Texto para Compras Y Proyectos Bajo Control</w:t>
+        <w:t>Texto para Fiscal e IMSS</w:t>
       </w:r>
     </w:p>
     <w:p>
       <w:r>
-        <w:t>Compras y proyectos bajo control: requisición, comparativo, orden, recepción y cierre.</w:t>
+        <w:t>Cumplir no es solo presentar a tiempo: es poder demostrarlo. Documentos al día, pagos con acuse y expediente por mes.</w:t>
       </w:r>
     </w:p>
     <w:p>
@@ -282,12 +282,12 @@
         <w:rPr>
           <w:color w:val="0E7C8B"/>
         </w:rPr>
-        <w:t>Texto para Una Página Para Decidir</w:t>
+        <w:t>Texto para Compras y proyectos</w:t>
       </w:r>
     </w:p>
     <w:p>
       <w:r>
-        <w:t>Una página para decidir: avances, pendientes, riesgos y decisiones requeridas.</w:t>
+        <w:t>Compras y proyectos bajo control: requisición, comparativo, autorización, orden, recepción y conciliación de tres vías.</w:t>
       </w:r>
     </w:p>
     <w:p>
@@ -298,12 +298,12 @@
         <w:rPr>
           <w:color w:val="0E7C8B"/>
         </w:rPr>
-        <w:t>Texto para Cierra Bien Tus Proyectos</w:t>
+        <w:t>Texto para Reporte para direccion</w:t>
       </w:r>
     </w:p>
     <w:p>
       <w:r>
-        <w:t>Un proyecto no termina al entregar. Termina al cerrar bien.</w:t>
+        <w:t>Dirección no necesita más datos: necesita saber qué decidir hoy. Tablero semanal con semáforos, riesgos y decisiones requeridas.</w:t>
       </w:r>
     </w:p>
     <w:p>
@@ -314,12 +314,44 @@
         <w:rPr>
           <w:color w:val="0E7C8B"/>
         </w:rPr>
-        <w:t>Texto para En 30 Días, Tu Operación En Orden</w:t>
+        <w:t>Texto para Cierre de proyectos</w:t>
       </w:r>
     </w:p>
     <w:p>
       <w:r>
-        <w:t>En 30 días: diagnóstico, plan, operación con controles y primer reporte para dirección.</w:t>
+        <w:t>Un proyecto no termina al entregar: termina al cerrar bien. Acta firmada, cifras conciliadas, pendientes en cero y expediente completo.</w:t>
+      </w:r>
+    </w:p>
+    <w:p>
+      <w:pPr>
+        <w:pStyle w:val="Heading2"/>
+      </w:pPr>
+      <w:r>
+        <w:rPr>
+          <w:color w:val="0E7C8B"/>
+        </w:rPr>
+        <w:t>Texto para Construccion control de obra</w:t>
+      </w:r>
+    </w:p>
+    <w:p>
+      <w:r>
+        <w:t>Para constructoras: control de compras, contratistas, estimaciones, facturación y expediente de obra. Una obra bien construida necesita una administración bien documentada.</w:t>
+      </w:r>
+    </w:p>
+    <w:p>
+      <w:pPr>
+        <w:pStyle w:val="Heading2"/>
+      </w:pPr>
+      <w:r>
+        <w:rPr>
+          <w:color w:val="0E7C8B"/>
+        </w:rPr>
+        <w:t>Texto para Industria continuidad operativa</w:t>
+      </w:r>
+    </w:p>
+    <w:p>
+      <w:r>
+        <w:t>Para industria: continuidad operativa con compras, proveedores, personal, cumplimiento y reportes para dirección documentados y con responsable.</w:t>
       </w:r>
     </w:p>
     <w:sectPr>

</xml_diff>